<commit_message>
Close detail card on outside click; prominent compare close button; refresh Substack copy
1) Clicking anywhere off a bar (empty chart space or elsewhere on the page) now
   closes the open country detail card.
2) The comparison table close control is a clear green "Close x" button instead of
   a faint x.
Also refresh substack-summary (md + docx) with updated language: the utilitarian
framing, the beating-expectations default, DR Congo as the pick, and the link.

Co-Authored-By: Claude Opus 4.8 (1M context) <noreply@anthropic.com>
Claude-Session: https://claude.ai/code/session_01MwDALgxh8kMfEbeUioJRsf
</commit_message>
<xml_diff>
--- a/worldcup/substack-summary.docx
+++ b/worldcup/substack-summary.docx
@@ -15,7 +15,7 @@
         <w:rPr>
           <w:sz w:val="24"/>
         </w:rPr>
-        <w:t>In 2014 I argued in The New York Times that if you have no team in the World Cup, you should root for the one whose victory would add the most happiness to the world. That points you toward a big, soccer-loving, lower-income country, where a title means the most. Back then the answer was Nigeria. The 2026 tournament has 48 teams and reaches further into exactly those places, so I rebuilt the guide, with more nuance and, thanks to AI, at a fraction of the old cost. It updates itself as the games are played.</w:t>
+        <w:t>In 2014 I wrote in The New York Times that if your own team is not in the World Cup, you should root for the one whose victory would do the most good. Add up the happiness a title would create, more where more people care, more where incomes are lower, and more where a win would be a first rather than a habit, and root for the country on top. That year it was Nigeria. With 48 teams in 2026, and more of the world's poorer and first-time sides in the field, I rebuilt the guide, with more nuance and, thanks to AI, at a fraction of the old cost. It updates itself as the games are played.</w:t>
       </w:r>
     </w:p>
     <w:p>
@@ -23,7 +23,7 @@
         <w:rPr>
           <w:sz w:val="24"/>
         </w:rPr>
-        <w:t>The new version weighs three things: how many people care, how much a windfall is worth to them (more where incomes are lower, in line with utilitarianism and a good deal of common sense), and how long the joy lasts, since a first title is remembered for years while a serial winner has forgotten by next season. By default it ranks teams not by who should win, but by who is beating expectations, which is where most of a tournament's joy actually comes from. This year's headline pick: the Democratic Republic of the Congo. The full interactive guide, including who to root for tonight, is here:</w:t>
+        <w:t>There is a twist this time. A champion is crowned only once, but the tournament gives joy every night, and the best of it comes from surprise. So the guide's default is not who should win it all, but who is beating expectations: a long shot reaching the quarterfinals thrills more than a favorite who was always going to be there. The headline pick for the title is the Democratic Republic of the Congo. But open the interactive guide, choose your lens, and see who to pull for tonight:</w:t>
       </w:r>
     </w:p>
     <w:p>

</xml_diff>